<commit_message>
Prepsat sablonu faktury na placeholdery misto textu "Doplnit"
Cislo faktury, datum splatnosti, radek polozek, celkova castka, cislo
uctu a variabilni symbol uz nejsou natvrdo "Doplnit", ale placeholdery
napojene na formular a vypocet (${cisloFaktury}, ${splatnost},
${polozka.*}, ${celkem}, ${dodavatel.cisloUctu}, ${variabilniSymbol}).
Dodavatel rozdelen na tri radky (nazev/sidlo/ICO) misto jedne vety, aby
kazda cast mela vlastni placeholder ze DodavatelProperties.

Sablona upravena primo v zabalenem .docx (nahrazeni textu ve
word/document.xml) - zbytek souboru (styly, sirky sloupcu, ohraniceni
tabulky) zustal beze zmeny.
</commit_message>
<xml_diff>
--- a/src/main/resources/word-templates/faktura.docx
+++ b/src/main/resources/word-templates/faktura.docx
@@ -42,7 +42,7 @@
     </w:p>
     <w:p>
       <w:r>
-        <w:t>Číslo faktury: Doplnit</w:t>
+        <w:t>Číslo faktury: ${cisloFaktury}</w:t>
       </w:r>
     </w:p>
     <w:p>
@@ -55,7 +55,7 @@
         <w:spacing w:after="200"/>
       </w:pPr>
       <w:r>
-        <w:t>Datum splatnosti: Doplnit</w:t>
+        <w:t>Datum splatnosti: ${splatnost}</w:t>
       </w:r>
     </w:p>
     <w:p>
@@ -71,11 +71,21 @@
       </w:r>
     </w:p>
     <w:p>
+      <w:r>
+        <w:t>${dodavatel.nazev}</w:t>
+      </w:r>
+    </w:p>
+    <w:p>
+      <w:r>
+        <w:t>se sídlem ${dodavatel.sidlo}</w:t>
+      </w:r>
+    </w:p>
+    <w:p>
       <w:pPr>
         <w:spacing w:after="200"/>
       </w:pPr>
       <w:r>
-        <w:t>Coreforge, se sídlem Praha, Česká republika</w:t>
+        <w:t>IČO: ${dodavatel.ico}</w:t>
       </w:r>
     </w:p>
     <w:p>
@@ -200,28 +210,28 @@
         <w:tc>
           <w:p>
             <w:r>
-              <w:t>Doplnit podle skutečnosti</w:t>
-            </w:r>
-          </w:p>
-        </w:tc>
-        <w:tc>
-          <w:p>
-            <w:r>
-              <w:t>—</w:t>
-            </w:r>
-          </w:p>
-        </w:tc>
-        <w:tc>
-          <w:p>
-            <w:r>
-              <w:t>—</w:t>
-            </w:r>
-          </w:p>
-        </w:tc>
-        <w:tc>
-          <w:p>
-            <w:r>
-              <w:t>—</w:t>
+              <w:t>${polozka.nazev}</w:t>
+            </w:r>
+          </w:p>
+        </w:tc>
+        <w:tc>
+          <w:p>
+            <w:r>
+              <w:t>${polozka.mnozstvi}</w:t>
+            </w:r>
+          </w:p>
+        </w:tc>
+        <w:tc>
+          <w:p>
+            <w:r>
+              <w:t>${polozka.cena}</w:t>
+            </w:r>
+          </w:p>
+        </w:tc>
+        <w:tc>
+          <w:p>
+            <w:r>
+              <w:t>${polozka.celkem}</w:t>
             </w:r>
           </w:p>
         </w:tc>
@@ -235,7 +245,7 @@
         <w:rPr>
           <w:b w:val="on"/>
         </w:rPr>
-        <w:t>Celkem k úhradě: Doplnit Kč</w:t>
+        <w:t>Celkem k úhradě: ${celkem} Kč</w:t>
       </w:r>
     </w:p>
     <w:p>
@@ -252,7 +262,7 @@
     </w:p>
     <w:p>
       <w:r>
-        <w:t>Číslo účtu: Doplnit</w:t>
+        <w:t>Číslo účtu: ${dodavatel.cisloUctu}</w:t>
       </w:r>
     </w:p>
     <w:p>
@@ -260,7 +270,7 @@
         <w:spacing w:after="200"/>
       </w:pPr>
       <w:r>
-        <w:t>Variabilní symbol: Doplnit</w:t>
+        <w:t>Variabilní symbol: ${variabilniSymbol}</w:t>
       </w:r>
     </w:p>
     <w:p>

</xml_diff>